<commit_message>
Konsultation abgehalten; Methodik ausgearbeitet, Vorlage für Thesis erhalten
</commit_message>
<xml_diff>
--- a/Konzeptionierung/NO Spezifikationen/Schnittstelle für NO-Surrogat.docx
+++ b/Konzeptionierung/NO Spezifikationen/Schnittstelle für NO-Surrogat.docx
@@ -233,22 +233,34 @@
         <w:t>F</w:t>
       </w:r>
       <w:r>
-        <w:t>NO-Surrogat anstelle von 7) _solve_poisson_equation() einfügen, da hie</w:t>
-      </w:r>
-      <w:r>
-        <w:t>r</w:t>
-      </w:r>
-      <w:r>
-        <w:t xml:space="preserve"> drin Green-Funktion(6), dann</w:t>
-      </w:r>
-      <w:r>
-        <w:t xml:space="preserve"> FFT-Berechnung (</w:t>
+        <w:t xml:space="preserve">NO-Surrogat </w:t>
+      </w:r>
+      <w:r>
+        <w:t>in</w:t>
+      </w:r>
+      <w:r>
+        <w:t xml:space="preserve"> 7) _solve_poisson_equation() einfügen, </w:t>
+      </w:r>
+      <w:r>
+        <w:t xml:space="preserve">wo FFT von </w:t>
+      </w:r>
+      <w:r>
+        <w:t>Green-Funktion(6)</w:t>
+      </w:r>
+      <w:r>
+        <w:t xml:space="preserve"> und _array_rho(5) </w:t>
       </w:r>
       <w:r>
         <w:t xml:space="preserve">hin </w:t>
       </w:r>
       <w:r>
-        <w:t>und zurück) erfolgt</w:t>
+        <w:t>und zurück</w:t>
+      </w:r>
+      <w:r>
+        <w:t xml:space="preserve"> von ihrer Multiplikation</w:t>
+      </w:r>
+      <w:r>
+        <w:t xml:space="preserve"> erfolgt</w:t>
       </w:r>
     </w:p>
     <w:p>
@@ -944,14 +956,16 @@
           <w:color w:val="BBBEBF"/>
           <w:sz w:val="21"/>
           <w:szCs w:val="21"/>
-        </w:rPr>
-      </w:pPr>
-      <w:r>
-        <w:rPr>
-          <w:rFonts w:ascii="Consolas" w:hAnsi="Consolas"/>
-          <w:color w:val="BBBEBF"/>
-          <w:sz w:val="21"/>
-          <w:szCs w:val="21"/>
+          <w:lang w:val="en-US"/>
+        </w:rPr>
+      </w:pPr>
+      <w:r>
+        <w:rPr>
+          <w:rFonts w:ascii="Consolas" w:hAnsi="Consolas"/>
+          <w:color w:val="BBBEBF"/>
+          <w:sz w:val="21"/>
+          <w:szCs w:val="21"/>
+          <w:lang w:val="en-US"/>
         </w:rPr>
         <w:t xml:space="preserve">gamma </w:t>
       </w:r>
@@ -961,6 +975,7 @@
           <w:color w:val="D4D4D4"/>
           <w:sz w:val="21"/>
           <w:szCs w:val="21"/>
+          <w:lang w:val="en-US"/>
         </w:rPr>
         <w:t>=</w:t>
       </w:r>
@@ -970,6 +985,7 @@
           <w:color w:val="BBBEBF"/>
           <w:sz w:val="21"/>
           <w:szCs w:val="21"/>
+          <w:lang w:val="en-US"/>
         </w:rPr>
         <w:t xml:space="preserve"> </w:t>
       </w:r>
@@ -979,6 +995,7 @@
           <w:color w:val="79C0FF"/>
           <w:sz w:val="21"/>
           <w:szCs w:val="21"/>
+          <w:lang w:val="en-US"/>
         </w:rPr>
         <w:t>ENERGY</w:t>
       </w:r>
@@ -988,6 +1005,7 @@
           <w:color w:val="BBBEBF"/>
           <w:sz w:val="21"/>
           <w:szCs w:val="21"/>
+          <w:lang w:val="en-US"/>
         </w:rPr>
         <w:t xml:space="preserve"> </w:t>
       </w:r>
@@ -997,6 +1015,7 @@
           <w:color w:val="D4D4D4"/>
           <w:sz w:val="21"/>
           <w:szCs w:val="21"/>
+          <w:lang w:val="en-US"/>
         </w:rPr>
         <w:t>/</w:t>
       </w:r>
@@ -1006,6 +1025,7 @@
           <w:color w:val="BBBEBF"/>
           <w:sz w:val="21"/>
           <w:szCs w:val="21"/>
+          <w:lang w:val="en-US"/>
         </w:rPr>
         <w:t xml:space="preserve"> </w:t>
       </w:r>
@@ -1015,6 +1035,7 @@
           <w:color w:val="79C0FF"/>
           <w:sz w:val="21"/>
           <w:szCs w:val="21"/>
+          <w:lang w:val="en-US"/>
         </w:rPr>
         <w:t>REST_ENERGY</w:t>
       </w:r>
@@ -1760,14 +1781,16 @@
           <w:color w:val="BBBEBF"/>
           <w:sz w:val="21"/>
           <w:szCs w:val="21"/>
-        </w:rPr>
-      </w:pPr>
-      <w:r>
-        <w:rPr>
-          <w:rFonts w:ascii="Consolas" w:hAnsi="Consolas"/>
-          <w:color w:val="BBBEBF"/>
-          <w:sz w:val="21"/>
-          <w:szCs w:val="21"/>
+          <w:lang w:val="en-US"/>
+        </w:rPr>
+      </w:pPr>
+      <w:r>
+        <w:rPr>
+          <w:rFonts w:ascii="Consolas" w:hAnsi="Consolas"/>
+          <w:color w:val="BBBEBF"/>
+          <w:sz w:val="21"/>
+          <w:szCs w:val="21"/>
+          <w:lang w:val="en-US"/>
         </w:rPr>
         <w:t>)</w:t>
       </w:r>
@@ -1782,6 +1805,7 @@
           <w:color w:val="BBBEBF"/>
           <w:sz w:val="21"/>
           <w:szCs w:val="21"/>
+          <w:lang w:val="en-US"/>
         </w:rPr>
       </w:pPr>
     </w:p>
@@ -1839,16 +1863,14 @@
           <w:color w:val="BBBEBF"/>
           <w:sz w:val="21"/>
           <w:szCs w:val="21"/>
-          <w:lang w:val="en-US"/>
-        </w:rPr>
-      </w:pPr>
-      <w:r>
-        <w:rPr>
-          <w:rFonts w:ascii="Consolas" w:hAnsi="Consolas"/>
-          <w:color w:val="BBBEBF"/>
-          <w:sz w:val="21"/>
-          <w:szCs w:val="21"/>
-          <w:lang w:val="en-US"/>
+        </w:rPr>
+      </w:pPr>
+      <w:r>
+        <w:rPr>
+          <w:rFonts w:ascii="Consolas" w:hAnsi="Consolas"/>
+          <w:color w:val="BBBEBF"/>
+          <w:sz w:val="21"/>
+          <w:szCs w:val="21"/>
         </w:rPr>
         <w:t xml:space="preserve">outgoing </w:t>
       </w:r>
@@ -1858,7 +1880,6 @@
           <w:color w:val="D4D4D4"/>
           <w:sz w:val="21"/>
           <w:szCs w:val="21"/>
-          <w:lang w:val="en-US"/>
         </w:rPr>
         <w:t>=</w:t>
       </w:r>
@@ -1868,24 +1889,14 @@
           <w:color w:val="BBBEBF"/>
           <w:sz w:val="21"/>
           <w:szCs w:val="21"/>
-          <w:lang w:val="en-US"/>
         </w:rPr>
         <w:t xml:space="preserve"> segment.track(incoming)</w:t>
       </w:r>
     </w:p>
-    <w:p>
-      <w:pPr>
-        <w:rPr>
-          <w:lang w:val="en-US"/>
-        </w:rPr>
-      </w:pPr>
-    </w:p>
-    <w:p>
-      <w:r>
-        <w:t xml:space="preserve">Zitat Claude Opus 5 (cheetah_test.ipynb): </w:t>
-      </w:r>
-      <w:r>
-        <w:t>Die FFT-Faltung ist zyklisch, die Physik ist es nicht. Deshalb wird ρ auf das doppelte</w:t>
+    <w:p/>
+    <w:p>
+      <w:r>
+        <w:t>Zitat Claude Opus 5 (cheetah_test.ipynb): Die FFT-Faltung ist zyklisch, die Physik ist es nicht. Deshalb wird ρ auf das doppelte</w:t>
       </w:r>
       <w:r>
         <w:t xml:space="preserve"> </w:t>
@@ -1910,12 +1921,114 @@
       </w:r>
     </w:p>
     <w:p>
-      <w:pPr>
-        <w:rPr>
-          <w:lang w:val="en-US"/>
-        </w:rPr>
-      </w:pPr>
-    </w:p>
+      <w:r>
+        <w:t>Zitat Claude Opus 5 Mittel</w:t>
+      </w:r>
+      <w:r>
+        <w:rPr>
+          <w:rStyle w:val="Funotenzeichen"/>
+        </w:rPr>
+        <w:footnoteReference w:id="1"/>
+      </w:r>
+      <w:r>
+        <w:t xml:space="preserve">: </w:t>
+      </w:r>
+      <w:r>
+        <w:t xml:space="preserve">Du ersetzt den </w:t>
+      </w:r>
+      <w:r>
+        <w:rPr>
+          <w:b/>
+          <w:bCs/>
+        </w:rPr>
+        <w:t>Lösungsoperator einer elliptischen PDE</w:t>
+      </w:r>
+      <w:r>
+        <w:t xml:space="preserve"> — eine Abbildung zwischen Funktionenräumen:</w:t>
+      </w:r>
+    </w:p>
+    <w:p>
+      <w:r>
+        <w:t>\mathcal{S}: \rho \;\longmapsto\; \phi</w:t>
+      </w:r>
+    </w:p>
+    <w:p>
+      <w:r>
+        <w:t xml:space="preserve">Li et al. lernen im FNO-Paper unter anderem </w:t>
+      </w:r>
+      <w:r>
+        <w:rPr>
+          <w:highlight w:val="yellow"/>
+        </w:rPr>
+        <w:t>Darcy-Flow, was strukturell dasselbe Tier ist — elliptisch, global gekoppelt</w:t>
+      </w:r>
+      <w:r>
+        <w:t>, Lösung hängt an jedem Punkt vom gesamten Eingabefeld ab.</w:t>
+      </w:r>
+    </w:p>
+    <w:p>
+      <w:r>
+        <w:lastRenderedPageBreak/>
+        <w:t xml:space="preserve">Der Charme dabei: die exakte Lösung ist eine Faltung im Ortsraum, also eine punktweise Multiplikation im Fourierraum. Genau das macht eine FNO-Schicht. Der Operator, den du lernen willst, liegt bauartlich schon in der Architektur — dein Netz muss im Grunde nur den Kern </w:t>
+      </w:r>
+      <w:r>
+        <w:rPr>
+          <w:highlight w:val="yellow"/>
+        </w:rPr>
+        <w:t>^G</w:t>
+      </w:r>
+      <w:r>
+        <w:rPr>
+          <w:highlight w:val="yellow"/>
+        </w:rPr>
+        <w:t xml:space="preserve"> approximieren und die</w:t>
+      </w:r>
+      <w:r>
+        <w:rPr>
+          <w:highlight w:val="yellow"/>
+        </w:rPr>
+        <w:t xml:space="preserve"> </w:t>
+      </w:r>
+      <w:r>
+        <w:rPr>
+          <w:highlight w:val="yellow"/>
+        </w:rPr>
+        <w:t>γ-Abhängigkeit mitlernen</w:t>
+      </w:r>
+      <w:r>
+        <w:t>, statt ihn analytisch aufzubauen.</w:t>
+      </w:r>
+    </w:p>
+    <w:p>
+      <w:r>
+        <w:t xml:space="preserve">Praktisch heißt das: die Schnittstelle liegt </w:t>
+      </w:r>
+      <w:r>
+        <w:t>innerhalb von</w:t>
+      </w:r>
+      <w:r>
+        <w:t xml:space="preserve"> _solve_poisson_equation. </w:t>
+      </w:r>
+      <w:r>
+        <w:rPr>
+          <w:lang w:val="en-US"/>
+        </w:rPr>
+        <w:t xml:space="preserve">Rein: charge_density (ungepaddet, grid_shape) plus </w:t>
+      </w:r>
+      <w:r>
+        <w:t>γ</w:t>
+      </w:r>
+      <w:r>
+        <w:rPr>
+          <w:lang w:val="en-US"/>
+        </w:rPr>
+        <w:t xml:space="preserve"> und cell_size. </w:t>
+      </w:r>
+      <w:r>
+        <w:t>Raus: potential auf demselben Gitter.</w:t>
+      </w:r>
+    </w:p>
+    <w:p/>
     <w:sectPr>
       <w:pgSz w:w="11906" w:h="16838"/>
       <w:pgMar w:top="1417" w:right="1417" w:bottom="1134" w:left="1417" w:header="708" w:footer="708" w:gutter="0"/>
@@ -1963,6 +2076,80 @@
 <w16cid:commentsIds xmlns:wpc="http://schemas.microsoft.com/office/word/2010/wordprocessingCanvas" xmlns:cx="http://schemas.microsoft.com/office/drawing/2014/chartex" xmlns:cx1="http://schemas.microsoft.com/office/drawing/2015/9/8/chartex" xmlns:cx2="http://schemas.microsoft.com/office/drawing/2015/10/21/chartex" xmlns:cx3="http://schemas.microsoft.com/office/drawing/2016/5/9/chartex" xmlns:cx4="http://schemas.microsoft.com/office/drawing/2016/5/10/chartex" xmlns:cx5="http://schemas.microsoft.com/office/drawing/2016/5/11/chartex" xmlns:cx6="http://schemas.microsoft.com/office/drawing/2016/5/12/chartex" xmlns:cx7="http://schemas.microsoft.com/office/drawing/2016/5/13/chartex" xmlns:cx8="http://schemas.microsoft.com/office/drawing/2016/5/14/chartex" xmlns:mc="http://schemas.openxmlformats.org/markup-compatibility/2006" xmlns:aink="http://schemas.microsoft.com/office/drawing/2016/ink" xmlns:am3d="http://schemas.microsoft.com/office/drawing/2017/model3d" xmlns:o="urn:schemas-microsoft-com:office:office" xmlns:oel="http://schemas.microsoft.com/office/2019/extlst" xmlns:r="http://schemas.openxmlformats.org/officeDocument/2006/relationships" xmlns:m="http://schemas.openxmlformats.org/officeDocument/2006/math" xmlns:v="urn:schemas-microsoft-com:vml" xmlns:wp14="http://schemas.microsoft.com/office/word/2010/wordprocessingDrawing" xmlns:wp="http://schemas.openxmlformats.org/drawingml/2006/wordprocessingDrawing" xmlns:w10="urn:schemas-microsoft-com:office:word" xmlns:w="http://schemas.openxmlformats.org/wordprocessingml/2006/main" xmlns:w14="http://schemas.microsoft.com/office/word/2010/wordml" xmlns:w15="http://schemas.microsoft.com/office/word/2012/wordml" xmlns:w16cex="http://schemas.microsoft.com/office/word/2018/wordml/cex" xmlns:w16cid="http://schemas.microsoft.com/office/word/2016/wordml/cid" xmlns:w16="http://schemas.microsoft.com/office/word/2018/wordml" xmlns:w16sdtdh="http://schemas.microsoft.com/office/word/2020/wordml/sdtdatahash" xmlns:w16se="http://schemas.microsoft.com/office/word/2015/wordml/symex" xmlns:wpg="http://schemas.microsoft.com/office/word/2010/wordprocessingGroup" xmlns:wpi="http://schemas.microsoft.com/office/word/2010/wordprocessingInk" xmlns:wne="http://schemas.microsoft.com/office/word/2006/wordml" xmlns:wps="http://schemas.microsoft.com/office/word/2010/wordprocessingShape" mc:Ignorable="w14 w15 w16se w16cid w16 w16cex w16sdtdh wp14">
   <w16cid:commentId w16cid:paraId="62C85A36" w16cid:durableId="653F864B"/>
 </w16cid:commentsIds>
+</file>
+
+<file path=word/endnotes.xml><?xml version="1.0" encoding="utf-8"?>
+<w:endnotes xmlns:wpc="http://schemas.microsoft.com/office/word/2010/wordprocessingCanvas" xmlns:cx="http://schemas.microsoft.com/office/drawing/2014/chartex" xmlns:cx1="http://schemas.microsoft.com/office/drawing/2015/9/8/chartex" xmlns:cx2="http://schemas.microsoft.com/office/drawing/2015/10/21/chartex" xmlns:cx3="http://schemas.microsoft.com/office/drawing/2016/5/9/chartex" xmlns:cx4="http://schemas.microsoft.com/office/drawing/2016/5/10/chartex" xmlns:cx5="http://schemas.microsoft.com/office/drawing/2016/5/11/chartex" xmlns:cx6="http://schemas.microsoft.com/office/drawing/2016/5/12/chartex" xmlns:cx7="http://schemas.microsoft.com/office/drawing/2016/5/13/chartex" xmlns:cx8="http://schemas.microsoft.com/office/drawing/2016/5/14/chartex" xmlns:mc="http://schemas.openxmlformats.org/markup-compatibility/2006" xmlns:aink="http://schemas.microsoft.com/office/drawing/2016/ink" xmlns:am3d="http://schemas.microsoft.com/office/drawing/2017/model3d" xmlns:o="urn:schemas-microsoft-com:office:office" xmlns:oel="http://schemas.microsoft.com/office/2019/extlst" xmlns:r="http://schemas.openxmlformats.org/officeDocument/2006/relationships" xmlns:m="http://schemas.openxmlformats.org/officeDocument/2006/math" xmlns:v="urn:schemas-microsoft-com:vml" xmlns:wp14="http://schemas.microsoft.com/office/word/2010/wordprocessingDrawing" xmlns:wp="http://schemas.openxmlformats.org/drawingml/2006/wordprocessingDrawing" xmlns:w10="urn:schemas-microsoft-com:office:word" xmlns:w="http://schemas.openxmlformats.org/wordprocessingml/2006/main" xmlns:w14="http://schemas.microsoft.com/office/word/2010/wordml" xmlns:w15="http://schemas.microsoft.com/office/word/2012/wordml" xmlns:w16cex="http://schemas.microsoft.com/office/word/2018/wordml/cex" xmlns:w16cid="http://schemas.microsoft.com/office/word/2016/wordml/cid" xmlns:w16="http://schemas.microsoft.com/office/word/2018/wordml" xmlns:w16sdtdh="http://schemas.microsoft.com/office/word/2020/wordml/sdtdatahash" xmlns:w16se="http://schemas.microsoft.com/office/word/2015/wordml/symex" xmlns:wpg="http://schemas.microsoft.com/office/word/2010/wordprocessingGroup" xmlns:wpi="http://schemas.microsoft.com/office/word/2010/wordprocessingInk" xmlns:wne="http://schemas.microsoft.com/office/word/2006/wordml" xmlns:wps="http://schemas.microsoft.com/office/word/2010/wordprocessingShape" mc:Ignorable="w14 w15 w16se w16cid w16 w16cex w16sdtdh wp14">
+  <w:endnote w:type="separator" w:id="-1">
+    <w:p>
+      <w:pPr>
+        <w:spacing w:after="0" w:line="240" w:lineRule="auto"/>
+      </w:pPr>
+      <w:r>
+        <w:separator/>
+      </w:r>
+    </w:p>
+  </w:endnote>
+  <w:endnote w:type="continuationSeparator" w:id="0">
+    <w:p>
+      <w:pPr>
+        <w:spacing w:after="0" w:line="240" w:lineRule="auto"/>
+      </w:pPr>
+      <w:r>
+        <w:continuationSeparator/>
+      </w:r>
+    </w:p>
+  </w:endnote>
+</w:endnotes>
+</file>
+
+<file path=word/footnotes.xml><?xml version="1.0" encoding="utf-8"?>
+<w:footnotes xmlns:wpc="http://schemas.microsoft.com/office/word/2010/wordprocessingCanvas" xmlns:cx="http://schemas.microsoft.com/office/drawing/2014/chartex" xmlns:cx1="http://schemas.microsoft.com/office/drawing/2015/9/8/chartex" xmlns:cx2="http://schemas.microsoft.com/office/drawing/2015/10/21/chartex" xmlns:cx3="http://schemas.microsoft.com/office/drawing/2016/5/9/chartex" xmlns:cx4="http://schemas.microsoft.com/office/drawing/2016/5/10/chartex" xmlns:cx5="http://schemas.microsoft.com/office/drawing/2016/5/11/chartex" xmlns:cx6="http://schemas.microsoft.com/office/drawing/2016/5/12/chartex" xmlns:cx7="http://schemas.microsoft.com/office/drawing/2016/5/13/chartex" xmlns:cx8="http://schemas.microsoft.com/office/drawing/2016/5/14/chartex" xmlns:mc="http://schemas.openxmlformats.org/markup-compatibility/2006" xmlns:aink="http://schemas.microsoft.com/office/drawing/2016/ink" xmlns:am3d="http://schemas.microsoft.com/office/drawing/2017/model3d" xmlns:o="urn:schemas-microsoft-com:office:office" xmlns:oel="http://schemas.microsoft.com/office/2019/extlst" xmlns:r="http://schemas.openxmlformats.org/officeDocument/2006/relationships" xmlns:m="http://schemas.openxmlformats.org/officeDocument/2006/math" xmlns:v="urn:schemas-microsoft-com:vml" xmlns:wp14="http://schemas.microsoft.com/office/word/2010/wordprocessingDrawing" xmlns:wp="http://schemas.openxmlformats.org/drawingml/2006/wordprocessingDrawing" xmlns:w10="urn:schemas-microsoft-com:office:word" xmlns:w="http://schemas.openxmlformats.org/wordprocessingml/2006/main" xmlns:w14="http://schemas.microsoft.com/office/word/2010/wordml" xmlns:w15="http://schemas.microsoft.com/office/word/2012/wordml" xmlns:w16cex="http://schemas.microsoft.com/office/word/2018/wordml/cex" xmlns:w16cid="http://schemas.microsoft.com/office/word/2016/wordml/cid" xmlns:w16="http://schemas.microsoft.com/office/word/2018/wordml" xmlns:w16sdtdh="http://schemas.microsoft.com/office/word/2020/wordml/sdtdatahash" xmlns:w16se="http://schemas.microsoft.com/office/word/2015/wordml/symex" xmlns:wpg="http://schemas.microsoft.com/office/word/2010/wordprocessingGroup" xmlns:wpi="http://schemas.microsoft.com/office/word/2010/wordprocessingInk" xmlns:wne="http://schemas.microsoft.com/office/word/2006/wordml" xmlns:wps="http://schemas.microsoft.com/office/word/2010/wordprocessingShape" mc:Ignorable="w14 w15 w16se w16cid w16 w16cex w16sdtdh wp14">
+  <w:footnote w:type="separator" w:id="-1">
+    <w:p>
+      <w:pPr>
+        <w:spacing w:after="0" w:line="240" w:lineRule="auto"/>
+      </w:pPr>
+      <w:r>
+        <w:separator/>
+      </w:r>
+    </w:p>
+  </w:footnote>
+  <w:footnote w:type="continuationSeparator" w:id="0">
+    <w:p>
+      <w:pPr>
+        <w:spacing w:after="0" w:line="240" w:lineRule="auto"/>
+      </w:pPr>
+      <w:r>
+        <w:continuationSeparator/>
+      </w:r>
+    </w:p>
+  </w:footnote>
+  <w:footnote w:id="1">
+    <w:p>
+      <w:pPr>
+        <w:pStyle w:val="Funotentext"/>
+      </w:pPr>
+      <w:r>
+        <w:rPr>
+          <w:rStyle w:val="Funotenzeichen"/>
+        </w:rPr>
+        <w:footnoteRef/>
+      </w:r>
+      <w:r>
+        <w:t xml:space="preserve"> </w:t>
+      </w:r>
+      <w:hyperlink r:id="rId1" w:history="1">
+        <w:r>
+          <w:rPr>
+            <w:rStyle w:val="Hyperlink"/>
+          </w:rPr>
+          <w:t>https://claude.ai/share/dc67a09f-9f7d-4ce9-b689-6e332cfc2f70</w:t>
+        </w:r>
+      </w:hyperlink>
+    </w:p>
+  </w:footnote>
+</w:footnotes>
 </file>
 
 <file path=word/numbering.xml><?xml version="1.0" encoding="utf-8"?>
@@ -3191,6 +3378,79 @@
       <w:szCs w:val="20"/>
     </w:rPr>
   </w:style>
+  <w:style w:type="paragraph" w:styleId="StandardWeb">
+    <w:name w:val="Normal (Web)"/>
+    <w:basedOn w:val="Standard"/>
+    <w:uiPriority w:val="99"/>
+    <w:semiHidden/>
+    <w:unhideWhenUsed/>
+    <w:rsid w:val="0078503E"/>
+    <w:rPr>
+      <w:rFonts w:ascii="Times New Roman" w:hAnsi="Times New Roman" w:cs="Times New Roman"/>
+    </w:rPr>
+  </w:style>
+  <w:style w:type="paragraph" w:styleId="Funotentext">
+    <w:name w:val="footnote text"/>
+    <w:basedOn w:val="Standard"/>
+    <w:link w:val="FunotentextZchn"/>
+    <w:uiPriority w:val="99"/>
+    <w:semiHidden/>
+    <w:unhideWhenUsed/>
+    <w:rsid w:val="0078503E"/>
+    <w:pPr>
+      <w:spacing w:after="0" w:line="240" w:lineRule="auto"/>
+    </w:pPr>
+    <w:rPr>
+      <w:sz w:val="20"/>
+      <w:szCs w:val="20"/>
+    </w:rPr>
+  </w:style>
+  <w:style w:type="character" w:customStyle="1" w:styleId="FunotentextZchn">
+    <w:name w:val="Fußnotentext Zchn"/>
+    <w:basedOn w:val="Absatz-Standardschriftart"/>
+    <w:link w:val="Funotentext"/>
+    <w:uiPriority w:val="99"/>
+    <w:semiHidden/>
+    <w:rsid w:val="0078503E"/>
+    <w:rPr>
+      <w:sz w:val="20"/>
+      <w:szCs w:val="20"/>
+    </w:rPr>
+  </w:style>
+  <w:style w:type="character" w:styleId="Funotenzeichen">
+    <w:name w:val="footnote reference"/>
+    <w:basedOn w:val="Absatz-Standardschriftart"/>
+    <w:uiPriority w:val="99"/>
+    <w:semiHidden/>
+    <w:unhideWhenUsed/>
+    <w:rsid w:val="0078503E"/>
+    <w:rPr>
+      <w:vertAlign w:val="superscript"/>
+    </w:rPr>
+  </w:style>
+  <w:style w:type="character" w:styleId="Hyperlink">
+    <w:name w:val="Hyperlink"/>
+    <w:basedOn w:val="Absatz-Standardschriftart"/>
+    <w:uiPriority w:val="99"/>
+    <w:unhideWhenUsed/>
+    <w:rsid w:val="0078503E"/>
+    <w:rPr>
+      <w:color w:val="467886" w:themeColor="hyperlink"/>
+      <w:u w:val="single"/>
+    </w:rPr>
+  </w:style>
+  <w:style w:type="character" w:styleId="NichtaufgelsteErwhnung">
+    <w:name w:val="Unresolved Mention"/>
+    <w:basedOn w:val="Absatz-Standardschriftart"/>
+    <w:uiPriority w:val="99"/>
+    <w:semiHidden/>
+    <w:unhideWhenUsed/>
+    <w:rsid w:val="0078503E"/>
+    <w:rPr>
+      <w:color w:val="605E5C"/>
+      <w:shd w:val="clear" w:color="auto" w:fill="E1DFDD"/>
+    </w:rPr>
+  </w:style>
 </w:styles>
 </file>
 
@@ -3487,4 +3747,16 @@
     </a:ext>
   </a:extLst>
 </a:theme>
+</file>
+
+<file path=customXml/item1.xml><?xml version="1.0" encoding="utf-8"?>
+<b:Sources xmlns:b="http://schemas.openxmlformats.org/officeDocument/2006/bibliography" xmlns="http://schemas.openxmlformats.org/officeDocument/2006/bibliography" SelectedStyle="\APASixthEditionOfficeOnline.xsl" StyleName="APA" Version="6"/>
+</file>
+
+<file path=customXml/itemProps1.xml><?xml version="1.0" encoding="utf-8"?>
+<ds:datastoreItem xmlns:ds="http://schemas.openxmlformats.org/officeDocument/2006/customXml" ds:itemID="{BEA1900B-505C-49D7-A2B1-A7F65D980454}">
+  <ds:schemaRefs>
+    <ds:schemaRef ds:uri="http://schemas.openxmlformats.org/officeDocument/2006/bibliography"/>
+  </ds:schemaRefs>
+</ds:datastoreItem>
 </file>
</xml_diff>